<commit_message>
LeviathADM 2.0.1 — agente Copilot Studio configurato e provato: prompt con Leggi file vault su OneDrive, istruzioni con sezione Strumenti, guida di installazione per gli altri PM, manuale allineato
Co-Authored-By: Claude Fable 5.1 <noreply@anthropic.com>
Claude-Session: https://claude.ai/code/session_01Sk11hf9sUH87YbHfmmyD12
</commit_message>
<xml_diff>
--- a/PO 2026/ADM903-01-0A/ADM903-01-0A - 20261026 Resoconto Startup.docx
+++ b/PO 2026/ADM903-01-0A/ADM903-01-0A - 20261026 Resoconto Startup.docx
@@ -402,7 +402,7 @@
                 <w:sz w:val="20"/>
                 <w:szCs w:val="20"/>
               </w:rPr>
-              <w:t>27/10/2026</w:t>
+              <w:t>29/10/2026</w:t>
             </w:r>
           </w:p>
         </w:tc>
@@ -2104,7 +2104,7 @@
           <w:sz w:val="22"/>
           <w:szCs w:val="22"/>
         </w:rPr>
-        <w:t xml:space="preserve">SOGEI — predisporre il documento di analisi — entro il 26/11/2026</w:t>
+        <w:t xml:space="preserve">SOGEI — predisporre il documento di analisi — entro il 28/11/2026</w:t>
       </w:r>
     </w:p>
     <w:p>
@@ -2122,7 +2122,7 @@
           <w:sz w:val="22"/>
           <w:szCs w:val="22"/>
         </w:rPr>
-        <w:t xml:space="preserve">RB — fornire l'elenco delle categorie di alchimisti — entro il 06/11/2026</w:t>
+        <w:t xml:space="preserve">RB — fornire l'elenco delle categorie di alchimisti — entro il 08/11/2026</w:t>
       </w:r>
     </w:p>
     <w:p>

</xml_diff>